<commit_message>
Rework code and fix files
</commit_message>
<xml_diff>
--- a/EduSoft.docx
+++ b/EduSoft.docx
@@ -234,6 +234,134 @@
               <w:color w:val="3494BA" w:themeColor="accent1"/>
             </w:rPr>
           </w:pPr>
+          <w:r>
+            <w:rPr>
+              <w:noProof/>
+              <w:color w:val="3494BA" w:themeColor="accent1"/>
+            </w:rPr>
+            <mc:AlternateContent>
+              <mc:Choice Requires="wps">
+                <w:drawing>
+                  <wp:anchor distT="0" distB="0" distL="114300" distR="114300" simplePos="0" relativeHeight="251662336" behindDoc="0" locked="0" layoutInCell="1" allowOverlap="1" wp14:anchorId="2EB27862" wp14:editId="4E583FC3">
+                    <wp:simplePos x="0" y="0"/>
+                    <wp:positionH relativeFrom="margin">
+                      <wp:posOffset>0</wp:posOffset>
+                    </wp:positionH>
+                    <wp:positionV relativeFrom="page">
+                      <wp:posOffset>9655233</wp:posOffset>
+                    </wp:positionV>
+                    <wp:extent cx="6553200" cy="557784"/>
+                    <wp:effectExtent l="0" t="0" r="0" b="12700"/>
+                    <wp:wrapNone/>
+                    <wp:docPr id="142" name="Text Box 146"/>
+                    <wp:cNvGraphicFramePr/>
+                    <a:graphic xmlns:a="http://schemas.openxmlformats.org/drawingml/2006/main">
+                      <a:graphicData uri="http://schemas.microsoft.com/office/word/2010/wordprocessingShape">
+                        <wps:wsp>
+                          <wps:cNvSpPr txBox="1"/>
+                          <wps:spPr>
+                            <a:xfrm>
+                              <a:off x="0" y="0"/>
+                              <a:ext cx="6553200" cy="557784"/>
+                            </a:xfrm>
+                            <a:prstGeom prst="rect">
+                              <a:avLst/>
+                            </a:prstGeom>
+                            <a:noFill/>
+                            <a:ln w="6350">
+                              <a:noFill/>
+                            </a:ln>
+                            <a:effectLst/>
+                          </wps:spPr>
+                          <wps:style>
+                            <a:lnRef idx="0">
+                              <a:schemeClr val="accent1"/>
+                            </a:lnRef>
+                            <a:fillRef idx="0">
+                              <a:schemeClr val="accent1"/>
+                            </a:fillRef>
+                            <a:effectRef idx="0">
+                              <a:schemeClr val="accent1"/>
+                            </a:effectRef>
+                            <a:fontRef idx="minor">
+                              <a:schemeClr val="dk1"/>
+                            </a:fontRef>
+                          </wps:style>
+                          <wps:txbx>
+                            <w:txbxContent>
+                              <w:p>
+                                <w:pPr>
+                                  <w:pStyle w:val="NoSpacing"/>
+                                  <w:jc w:val="center"/>
+                                  <w:rPr>
+                                    <w:color w:val="3494BA" w:themeColor="accent1"/>
+                                  </w:rPr>
+                                </w:pPr>
+                                <w:r>
+                                  <w:rPr>
+                                    <w:caps/>
+                                    <w:color w:val="3494BA" w:themeColor="accent1"/>
+                                    <w:sz w:val="28"/>
+                                    <w:szCs w:val="28"/>
+                                  </w:rPr>
+                                  <w:t>eduSoft</w:t>
+                                </w:r>
+                              </w:p>
+                            </w:txbxContent>
+                          </wps:txbx>
+                          <wps:bodyPr rot="0" spcFirstLastPara="0" vertOverflow="overflow" horzOverflow="overflow" vert="horz" wrap="square" lIns="0" tIns="0" rIns="0" bIns="0" numCol="1" spcCol="0" rtlCol="0" fromWordArt="0" anchor="b" anchorCtr="0" forceAA="0" compatLnSpc="1">
+                            <a:prstTxWarp prst="textNoShape">
+                              <a:avLst/>
+                            </a:prstTxWarp>
+                            <a:spAutoFit/>
+                          </wps:bodyPr>
+                        </wps:wsp>
+                      </a:graphicData>
+                    </a:graphic>
+                    <wp14:sizeRelH relativeFrom="margin">
+                      <wp14:pctWidth>100000</wp14:pctWidth>
+                    </wp14:sizeRelH>
+                    <wp14:sizeRelV relativeFrom="margin">
+                      <wp14:pctHeight>0</wp14:pctHeight>
+                    </wp14:sizeRelV>
+                  </wp:anchor>
+                </w:drawing>
+              </mc:Choice>
+              <mc:Fallback>
+                <w:pict>
+                  <v:shapetype w14:anchorId="2EB27862" id="_x0000_t202" coordsize="21600,21600" o:spt="202" path="m,l,21600r21600,l21600,xe">
+                    <v:stroke joinstyle="miter"/>
+                    <v:path gradientshapeok="t" o:connecttype="rect"/>
+                  </v:shapetype>
+                  <v:shape id="Text Box 146" o:spid="_x0000_s1026" type="#_x0000_t202" style="position:absolute;margin-left:0;margin-top:760.25pt;width:516pt;height:43.9pt;z-index:251662336;visibility:visible;mso-wrap-style:square;mso-width-percent:1000;mso-height-percent:0;mso-wrap-distance-left:9pt;mso-wrap-distance-top:0;mso-wrap-distance-right:9pt;mso-wrap-distance-bottom:0;mso-position-horizontal:absolute;mso-position-horizontal-relative:margin;mso-position-vertical:absolute;mso-position-vertical-relative:page;mso-width-percent:1000;mso-height-percent:0;mso-width-relative:margin;mso-height-relative:margin;v-text-anchor:bottom" o:gfxdata="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" filled="f" stroked="f" strokeweight=".5pt">
+                    <v:textbox style="mso-fit-shape-to-text:t" inset="0,0,0,0">
+                      <w:txbxContent>
+                        <w:p>
+                          <w:pPr>
+                            <w:pStyle w:val="NoSpacing"/>
+                            <w:jc w:val="center"/>
+                            <w:rPr>
+                              <w:color w:val="3494BA" w:themeColor="accent1"/>
+                            </w:rPr>
+                          </w:pPr>
+                          <w:r>
+                            <w:rPr>
+                              <w:caps/>
+                              <w:color w:val="3494BA" w:themeColor="accent1"/>
+                              <w:sz w:val="28"/>
+                              <w:szCs w:val="28"/>
+                            </w:rPr>
+                            <w:t>eduSoft</w:t>
+                          </w:r>
+                        </w:p>
+                      </w:txbxContent>
+                    </v:textbox>
+                    <w10:wrap anchorx="margin" anchory="page"/>
+                  </v:shape>
+                </w:pict>
+              </mc:Fallback>
+            </mc:AlternateContent>
+          </w:r>
           <w:r>
             <w:rPr>
               <w:b/>
@@ -1212,7 +1340,7 @@
           </mc:Choice>
           <mc:Fallback>
             <w:pict>
-              <v:group w14:anchorId="504B0BE8" id="Graphic 17" o:spid="_x0000_s1026" alt="&quot;&quot;" style="position:absolute;margin-left:-38pt;margin-top:314.25pt;width:649.4pt;height:238.3pt;flip:x y;z-index:-251649024;mso-width-relative:margin;mso-height-relative:margin" coordorigin="-71,-71" coordsize="60055,19240" o:gfxdata="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">
+              <v:group w14:anchorId="6A76FDC0" id="Graphic 17" o:spid="_x0000_s1026" alt="&quot;&quot;" style="position:absolute;margin-left:-38pt;margin-top:314.25pt;width:649.4pt;height:238.3pt;flip:x y;z-index:-251649024;mso-width-relative:margin;mso-height-relative:margin" coordorigin="-71,-71" coordsize="60055,19240" o:gfxdata="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">
                 <v:shape id="Freeform: Shape 849552336" o:spid="_x0000_s1027" style="position:absolute;left:21216;top:-71;width:38767;height:17620;visibility:visible;mso-wrap-style:square;v-text-anchor:middle" coordsize="3876675,1762125" o:gfxdata="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" path="m3869531,1359694v,,-489585,474345,-1509712,384810c1339691,1654969,936784,1180624,7144,1287304l7144,7144r3862387,l3869531,1359694xe" fillcolor="#58b6c0 [3205]" stroked="f">
                   <v:stroke joinstyle="miter"/>
                   <v:path arrowok="t" o:connecttype="custom" o:connectlocs="3869531,1359694;2359819,1744504;7144,1287304;7144,7144;3869531,7144;3869531,1359694" o:connectangles="0,0,0,0,0,0"/>
@@ -1809,7 +1937,7 @@
           </mc:Choice>
           <mc:Fallback>
             <w:pict>
-              <v:group w14:anchorId="0587B15D" id="Graphic 17" o:spid="_x0000_s1026" alt="&quot;&quot;" style="position:absolute;margin-left:-54.3pt;margin-top:-163.65pt;width:649.4pt;height:238.3pt;z-index:-251652096;mso-width-relative:margin;mso-height-relative:margin" coordorigin="-71,-71" coordsize="60055,19240" o:gfxdata="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">
+              <v:group w14:anchorId="41CCBEBE" id="Graphic 17" o:spid="_x0000_s1026" alt="&quot;&quot;" style="position:absolute;margin-left:-54.3pt;margin-top:-163.65pt;width:649.4pt;height:238.3pt;z-index:-251652096;mso-width-relative:margin;mso-height-relative:margin" coordorigin="-71,-71" coordsize="60055,19240" o:gfxdata="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">
                 <v:shape id="Freeform: Shape 579409262" o:spid="_x0000_s1027" style="position:absolute;left:21216;top:-71;width:38767;height:17620;visibility:visible;mso-wrap-style:square;v-text-anchor:middle" coordsize="3876675,1762125" o:gfxdata="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" path="m3869531,1359694v,,-489585,474345,-1509712,384810c1339691,1654969,936784,1180624,7144,1287304l7144,7144r3862387,l3869531,1359694xe" fillcolor="#58b6c0 [3205]" stroked="f">
                   <v:stroke joinstyle="miter"/>
                   <v:path arrowok="t" o:connecttype="custom" o:connectlocs="3869531,1359694;2359819,1744504;7144,1287304;7144,7144;3869531,7144;3869531,1359694" o:connectangles="0,0,0,0,0,0"/>
@@ -2158,6 +2286,130 @@
           <w:lang w:val="bg-BG"/>
         </w:rPr>
       </w:pPr>
+      <w:r>
+        <w:rPr>
+          <w:noProof/>
+          <w:color w:val="3494BA" w:themeColor="accent1"/>
+        </w:rPr>
+        <mc:AlternateContent>
+          <mc:Choice Requires="wps">
+            <w:drawing>
+              <wp:anchor distT="0" distB="0" distL="114300" distR="114300" simplePos="0" relativeHeight="251686912" behindDoc="0" locked="0" layoutInCell="1" allowOverlap="1" wp14:anchorId="5A381043" wp14:editId="0F1985A4">
+                <wp:simplePos x="0" y="0"/>
+                <wp:positionH relativeFrom="margin">
+                  <wp:posOffset>-55418</wp:posOffset>
+                </wp:positionH>
+                <wp:positionV relativeFrom="page">
+                  <wp:posOffset>9677977</wp:posOffset>
+                </wp:positionV>
+                <wp:extent cx="6553200" cy="557784"/>
+                <wp:effectExtent l="0" t="0" r="0" b="12700"/>
+                <wp:wrapNone/>
+                <wp:docPr id="1349061770" name="Text Box 146"/>
+                <wp:cNvGraphicFramePr/>
+                <a:graphic xmlns:a="http://schemas.openxmlformats.org/drawingml/2006/main">
+                  <a:graphicData uri="http://schemas.microsoft.com/office/word/2010/wordprocessingShape">
+                    <wps:wsp>
+                      <wps:cNvSpPr txBox="1"/>
+                      <wps:spPr>
+                        <a:xfrm>
+                          <a:off x="0" y="0"/>
+                          <a:ext cx="6553200" cy="557784"/>
+                        </a:xfrm>
+                        <a:prstGeom prst="rect">
+                          <a:avLst/>
+                        </a:prstGeom>
+                        <a:noFill/>
+                        <a:ln w="6350">
+                          <a:noFill/>
+                        </a:ln>
+                        <a:effectLst/>
+                      </wps:spPr>
+                      <wps:style>
+                        <a:lnRef idx="0">
+                          <a:schemeClr val="accent1"/>
+                        </a:lnRef>
+                        <a:fillRef idx="0">
+                          <a:schemeClr val="accent1"/>
+                        </a:fillRef>
+                        <a:effectRef idx="0">
+                          <a:schemeClr val="accent1"/>
+                        </a:effectRef>
+                        <a:fontRef idx="minor">
+                          <a:schemeClr val="dk1"/>
+                        </a:fontRef>
+                      </wps:style>
+                      <wps:txbx>
+                        <w:txbxContent>
+                          <w:p>
+                            <w:pPr>
+                              <w:pStyle w:val="NoSpacing"/>
+                              <w:jc w:val="center"/>
+                              <w:rPr>
+                                <w:color w:val="3494BA" w:themeColor="accent1"/>
+                              </w:rPr>
+                            </w:pPr>
+                            <w:r>
+                              <w:rPr>
+                                <w:caps/>
+                                <w:color w:val="3494BA" w:themeColor="accent1"/>
+                                <w:sz w:val="28"/>
+                                <w:szCs w:val="28"/>
+                              </w:rPr>
+                              <w:t>eduSoft</w:t>
+                            </w:r>
+                          </w:p>
+                        </w:txbxContent>
+                      </wps:txbx>
+                      <wps:bodyPr rot="0" spcFirstLastPara="0" vertOverflow="overflow" horzOverflow="overflow" vert="horz" wrap="square" lIns="0" tIns="0" rIns="0" bIns="0" numCol="1" spcCol="0" rtlCol="0" fromWordArt="0" anchor="b" anchorCtr="0" forceAA="0" compatLnSpc="1">
+                        <a:prstTxWarp prst="textNoShape">
+                          <a:avLst/>
+                        </a:prstTxWarp>
+                        <a:spAutoFit/>
+                      </wps:bodyPr>
+                    </wps:wsp>
+                  </a:graphicData>
+                </a:graphic>
+                <wp14:sizeRelH relativeFrom="margin">
+                  <wp14:pctWidth>100000</wp14:pctWidth>
+                </wp14:sizeRelH>
+                <wp14:sizeRelV relativeFrom="margin">
+                  <wp14:pctHeight>0</wp14:pctHeight>
+                </wp14:sizeRelV>
+              </wp:anchor>
+            </w:drawing>
+          </mc:Choice>
+          <mc:Fallback>
+            <w:pict>
+              <v:shape w14:anchorId="5A381043" id="_x0000_s1027" type="#_x0000_t202" style="position:absolute;margin-left:-4.35pt;margin-top:762.05pt;width:516pt;height:43.9pt;z-index:251686912;visibility:visible;mso-wrap-style:square;mso-width-percent:1000;mso-height-percent:0;mso-wrap-distance-left:9pt;mso-wrap-distance-top:0;mso-wrap-distance-right:9pt;mso-wrap-distance-bottom:0;mso-position-horizontal:absolute;mso-position-horizontal-relative:margin;mso-position-vertical:absolute;mso-position-vertical-relative:page;mso-width-percent:1000;mso-height-percent:0;mso-width-relative:margin;mso-height-relative:margin;v-text-anchor:bottom" o:gfxdata="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" filled="f" stroked="f" strokeweight=".5pt">
+                <v:textbox style="mso-fit-shape-to-text:t" inset="0,0,0,0">
+                  <w:txbxContent>
+                    <w:p>
+                      <w:pPr>
+                        <w:pStyle w:val="NoSpacing"/>
+                        <w:jc w:val="center"/>
+                        <w:rPr>
+                          <w:color w:val="3494BA" w:themeColor="accent1"/>
+                        </w:rPr>
+                      </w:pPr>
+                      <w:r>
+                        <w:rPr>
+                          <w:caps/>
+                          <w:color w:val="3494BA" w:themeColor="accent1"/>
+                          <w:sz w:val="28"/>
+                          <w:szCs w:val="28"/>
+                        </w:rPr>
+                        <w:t>eduSoft</w:t>
+                      </w:r>
+                    </w:p>
+                  </w:txbxContent>
+                </v:textbox>
+                <w10:wrap anchorx="margin" anchory="page"/>
+              </v:shape>
+            </w:pict>
+          </mc:Fallback>
+        </mc:AlternateContent>
+      </w:r>
       <w:r>
         <w:rPr>
           <w:sz w:val="36"/>
@@ -2676,7 +2928,7 @@
           </mc:Choice>
           <mc:Fallback>
             <w:pict>
-              <v:group w14:anchorId="3F7E2941" id="Graphic 17" o:spid="_x0000_s1026" alt="&quot;&quot;" style="position:absolute;margin-left:-40.55pt;margin-top:-77.85pt;width:649.4pt;height:238.3pt;z-index:-251646976;mso-width-relative:margin;mso-height-relative:margin" coordorigin="-71,-71" coordsize="60055,19240" o:gfxdata="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">
+              <v:group w14:anchorId="5F1AAFA1" id="Graphic 17" o:spid="_x0000_s1026" alt="&quot;&quot;" style="position:absolute;margin-left:-40.55pt;margin-top:-77.85pt;width:649.4pt;height:238.3pt;z-index:-251646976;mso-width-relative:margin;mso-height-relative:margin" coordorigin="-71,-71" coordsize="60055,19240" o:gfxdata="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">
                 <v:shape id="Freeform: Shape 343205425" o:spid="_x0000_s1027" style="position:absolute;left:21216;top:-71;width:38767;height:17620;visibility:visible;mso-wrap-style:square;v-text-anchor:middle" coordsize="3876675,1762125" o:gfxdata="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" path="m3869531,1359694v,,-489585,474345,-1509712,384810c1339691,1654969,936784,1180624,7144,1287304l7144,7144r3862387,l3869531,1359694xe" fillcolor="#58b6c0 [3205]" stroked="f">
                   <v:stroke joinstyle="miter"/>
                   <v:path arrowok="t" o:connecttype="custom" o:connectlocs="3869531,1359694;2359819,1744504;7144,1287304;7144,7144;3869531,7144;3869531,1359694" o:connectangles="0,0,0,0,0,0"/>
@@ -2837,6 +3089,130 @@
           <w:lang w:val="bg-BG"/>
         </w:rPr>
       </w:pPr>
+      <w:r>
+        <w:rPr>
+          <w:noProof/>
+          <w:color w:val="3494BA" w:themeColor="accent1"/>
+        </w:rPr>
+        <mc:AlternateContent>
+          <mc:Choice Requires="wps">
+            <w:drawing>
+              <wp:anchor distT="0" distB="0" distL="114300" distR="114300" simplePos="0" relativeHeight="251688960" behindDoc="0" locked="0" layoutInCell="1" allowOverlap="1" wp14:anchorId="37510794" wp14:editId="77133947">
+                <wp:simplePos x="0" y="0"/>
+                <wp:positionH relativeFrom="margin">
+                  <wp:posOffset>-110836</wp:posOffset>
+                </wp:positionH>
+                <wp:positionV relativeFrom="page">
+                  <wp:posOffset>9576378</wp:posOffset>
+                </wp:positionV>
+                <wp:extent cx="6553200" cy="557784"/>
+                <wp:effectExtent l="0" t="0" r="0" b="12700"/>
+                <wp:wrapNone/>
+                <wp:docPr id="1999520783" name="Text Box 146"/>
+                <wp:cNvGraphicFramePr/>
+                <a:graphic xmlns:a="http://schemas.openxmlformats.org/drawingml/2006/main">
+                  <a:graphicData uri="http://schemas.microsoft.com/office/word/2010/wordprocessingShape">
+                    <wps:wsp>
+                      <wps:cNvSpPr txBox="1"/>
+                      <wps:spPr>
+                        <a:xfrm>
+                          <a:off x="0" y="0"/>
+                          <a:ext cx="6553200" cy="557784"/>
+                        </a:xfrm>
+                        <a:prstGeom prst="rect">
+                          <a:avLst/>
+                        </a:prstGeom>
+                        <a:noFill/>
+                        <a:ln w="6350">
+                          <a:noFill/>
+                        </a:ln>
+                        <a:effectLst/>
+                      </wps:spPr>
+                      <wps:style>
+                        <a:lnRef idx="0">
+                          <a:schemeClr val="accent1"/>
+                        </a:lnRef>
+                        <a:fillRef idx="0">
+                          <a:schemeClr val="accent1"/>
+                        </a:fillRef>
+                        <a:effectRef idx="0">
+                          <a:schemeClr val="accent1"/>
+                        </a:effectRef>
+                        <a:fontRef idx="minor">
+                          <a:schemeClr val="dk1"/>
+                        </a:fontRef>
+                      </wps:style>
+                      <wps:txbx>
+                        <w:txbxContent>
+                          <w:p>
+                            <w:pPr>
+                              <w:pStyle w:val="NoSpacing"/>
+                              <w:jc w:val="center"/>
+                              <w:rPr>
+                                <w:color w:val="3494BA" w:themeColor="accent1"/>
+                              </w:rPr>
+                            </w:pPr>
+                            <w:r>
+                              <w:rPr>
+                                <w:caps/>
+                                <w:color w:val="3494BA" w:themeColor="accent1"/>
+                                <w:sz w:val="28"/>
+                                <w:szCs w:val="28"/>
+                              </w:rPr>
+                              <w:t>eduSoft</w:t>
+                            </w:r>
+                          </w:p>
+                        </w:txbxContent>
+                      </wps:txbx>
+                      <wps:bodyPr rot="0" spcFirstLastPara="0" vertOverflow="overflow" horzOverflow="overflow" vert="horz" wrap="square" lIns="0" tIns="0" rIns="0" bIns="0" numCol="1" spcCol="0" rtlCol="0" fromWordArt="0" anchor="b" anchorCtr="0" forceAA="0" compatLnSpc="1">
+                        <a:prstTxWarp prst="textNoShape">
+                          <a:avLst/>
+                        </a:prstTxWarp>
+                        <a:spAutoFit/>
+                      </wps:bodyPr>
+                    </wps:wsp>
+                  </a:graphicData>
+                </a:graphic>
+                <wp14:sizeRelH relativeFrom="margin">
+                  <wp14:pctWidth>100000</wp14:pctWidth>
+                </wp14:sizeRelH>
+                <wp14:sizeRelV relativeFrom="margin">
+                  <wp14:pctHeight>0</wp14:pctHeight>
+                </wp14:sizeRelV>
+              </wp:anchor>
+            </w:drawing>
+          </mc:Choice>
+          <mc:Fallback>
+            <w:pict>
+              <v:shape w14:anchorId="37510794" id="_x0000_s1028" type="#_x0000_t202" style="position:absolute;left:0;text-align:left;margin-left:-8.75pt;margin-top:754.05pt;width:516pt;height:43.9pt;z-index:251688960;visibility:visible;mso-wrap-style:square;mso-width-percent:1000;mso-height-percent:0;mso-wrap-distance-left:9pt;mso-wrap-distance-top:0;mso-wrap-distance-right:9pt;mso-wrap-distance-bottom:0;mso-position-horizontal:absolute;mso-position-horizontal-relative:margin;mso-position-vertical:absolute;mso-position-vertical-relative:page;mso-width-percent:1000;mso-height-percent:0;mso-width-relative:margin;mso-height-relative:margin;v-text-anchor:bottom" o:gfxdata="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" filled="f" stroked="f" strokeweight=".5pt">
+                <v:textbox style="mso-fit-shape-to-text:t" inset="0,0,0,0">
+                  <w:txbxContent>
+                    <w:p>
+                      <w:pPr>
+                        <w:pStyle w:val="NoSpacing"/>
+                        <w:jc w:val="center"/>
+                        <w:rPr>
+                          <w:color w:val="3494BA" w:themeColor="accent1"/>
+                        </w:rPr>
+                      </w:pPr>
+                      <w:r>
+                        <w:rPr>
+                          <w:caps/>
+                          <w:color w:val="3494BA" w:themeColor="accent1"/>
+                          <w:sz w:val="28"/>
+                          <w:szCs w:val="28"/>
+                        </w:rPr>
+                        <w:t>eduSoft</w:t>
+                      </w:r>
+                    </w:p>
+                  </w:txbxContent>
+                </v:textbox>
+                <w10:wrap anchorx="margin" anchory="page"/>
+              </v:shape>
+            </w:pict>
+          </mc:Fallback>
+        </mc:AlternateContent>
+      </w:r>
     </w:p>
     <w:p>
       <w:pPr>
@@ -3356,7 +3732,7 @@
           </mc:Choice>
           <mc:Fallback>
             <w:pict>
-              <v:group w14:anchorId="7D3188C1" id="Graphic 17" o:spid="_x0000_s1026" alt="&quot;&quot;" style="position:absolute;margin-left:-64.1pt;margin-top:-113.2pt;width:649.4pt;height:238.3pt;z-index:-251642880;mso-width-relative:margin;mso-height-relative:margin" coordorigin="-71,-71" coordsize="60055,19240" o:gfxdata="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">
+              <v:group w14:anchorId="60411C1A" id="Graphic 17" o:spid="_x0000_s1026" alt="&quot;&quot;" style="position:absolute;margin-left:-64.1pt;margin-top:-113.2pt;width:649.4pt;height:238.3pt;z-index:-251642880;mso-width-relative:margin;mso-height-relative:margin" coordorigin="-71,-71" coordsize="60055,19240" o:gfxdata="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">
                 <v:shape id="Freeform: Shape 1241910069" o:spid="_x0000_s1027" style="position:absolute;left:21216;top:-71;width:38767;height:17620;visibility:visible;mso-wrap-style:square;v-text-anchor:middle" coordsize="3876675,1762125" o:gfxdata="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" path="m3869531,1359694v,,-489585,474345,-1509712,384810c1339691,1654969,936784,1180624,7144,1287304l7144,7144r3862387,l3869531,1359694xe" fillcolor="#58b6c0 [3205]" stroked="f">
                   <v:stroke joinstyle="miter"/>
                   <v:path arrowok="t" o:connecttype="custom" o:connectlocs="3869531,1359694;2359819,1744504;7144,1287304;7144,7144;3869531,7144;3869531,1359694" o:connectangles="0,0,0,0,0,0"/>
@@ -3464,7 +3840,23 @@
           <w:sz w:val="36"/>
           <w:szCs w:val="36"/>
         </w:rPr>
-        <w:t>The test is a functional and effective tool for testing knowledge in natural sciences. It provides quick feedback, a clear final result and the ability to choose a category. It is written in C++ and is designed to assess the user's knowledge in three main categories of natural sciences: Biology, Chemistry and Physics. Each category contains 20 questions, with answers in the format A, B, C.</w:t>
+        <w:t xml:space="preserve">The test is a functional and effective tool for testing knowledge in natural sciences. It provides quick feedback, a clear </w:t>
+      </w:r>
+      <w:proofErr w:type="gramStart"/>
+      <w:r>
+        <w:rPr>
+          <w:sz w:val="36"/>
+          <w:szCs w:val="36"/>
+        </w:rPr>
+        <w:t>final result</w:t>
+      </w:r>
+      <w:proofErr w:type="gramEnd"/>
+      <w:r>
+        <w:rPr>
+          <w:sz w:val="36"/>
+          <w:szCs w:val="36"/>
+        </w:rPr>
+        <w:t xml:space="preserve"> and the ability to choose a category. It is written in C++ and is designed to assess the user's knowledge in three main categories of natural sciences: Biology, Chemistry and Physics. Each category contains 20 questions, with answers in the format A, B, C.</w:t>
       </w:r>
     </w:p>
     <w:p/>
@@ -3473,6 +3865,130 @@
         <w:spacing w:before="0" w:after="0"/>
         <w:ind w:left="0" w:right="0"/>
       </w:pPr>
+      <w:r>
+        <w:rPr>
+          <w:noProof/>
+          <w:color w:val="3494BA" w:themeColor="accent1"/>
+        </w:rPr>
+        <mc:AlternateContent>
+          <mc:Choice Requires="wps">
+            <w:drawing>
+              <wp:anchor distT="0" distB="0" distL="114300" distR="114300" simplePos="0" relativeHeight="251691008" behindDoc="0" locked="0" layoutInCell="1" allowOverlap="1" wp14:anchorId="1FE6D1D1" wp14:editId="66C41163">
+                <wp:simplePos x="0" y="0"/>
+                <wp:positionH relativeFrom="margin">
+                  <wp:posOffset>-92364</wp:posOffset>
+                </wp:positionH>
+                <wp:positionV relativeFrom="page">
+                  <wp:posOffset>9570662</wp:posOffset>
+                </wp:positionV>
+                <wp:extent cx="6553200" cy="557784"/>
+                <wp:effectExtent l="0" t="0" r="0" b="12700"/>
+                <wp:wrapNone/>
+                <wp:docPr id="2043510172" name="Text Box 146"/>
+                <wp:cNvGraphicFramePr/>
+                <a:graphic xmlns:a="http://schemas.openxmlformats.org/drawingml/2006/main">
+                  <a:graphicData uri="http://schemas.microsoft.com/office/word/2010/wordprocessingShape">
+                    <wps:wsp>
+                      <wps:cNvSpPr txBox="1"/>
+                      <wps:spPr>
+                        <a:xfrm>
+                          <a:off x="0" y="0"/>
+                          <a:ext cx="6553200" cy="557784"/>
+                        </a:xfrm>
+                        <a:prstGeom prst="rect">
+                          <a:avLst/>
+                        </a:prstGeom>
+                        <a:noFill/>
+                        <a:ln w="6350">
+                          <a:noFill/>
+                        </a:ln>
+                        <a:effectLst/>
+                      </wps:spPr>
+                      <wps:style>
+                        <a:lnRef idx="0">
+                          <a:schemeClr val="accent1"/>
+                        </a:lnRef>
+                        <a:fillRef idx="0">
+                          <a:schemeClr val="accent1"/>
+                        </a:fillRef>
+                        <a:effectRef idx="0">
+                          <a:schemeClr val="accent1"/>
+                        </a:effectRef>
+                        <a:fontRef idx="minor">
+                          <a:schemeClr val="dk1"/>
+                        </a:fontRef>
+                      </wps:style>
+                      <wps:txbx>
+                        <w:txbxContent>
+                          <w:p>
+                            <w:pPr>
+                              <w:pStyle w:val="NoSpacing"/>
+                              <w:jc w:val="center"/>
+                              <w:rPr>
+                                <w:color w:val="3494BA" w:themeColor="accent1"/>
+                              </w:rPr>
+                            </w:pPr>
+                            <w:r>
+                              <w:rPr>
+                                <w:caps/>
+                                <w:color w:val="3494BA" w:themeColor="accent1"/>
+                                <w:sz w:val="28"/>
+                                <w:szCs w:val="28"/>
+                              </w:rPr>
+                              <w:t>eduSoft</w:t>
+                            </w:r>
+                          </w:p>
+                        </w:txbxContent>
+                      </wps:txbx>
+                      <wps:bodyPr rot="0" spcFirstLastPara="0" vertOverflow="overflow" horzOverflow="overflow" vert="horz" wrap="square" lIns="0" tIns="0" rIns="0" bIns="0" numCol="1" spcCol="0" rtlCol="0" fromWordArt="0" anchor="b" anchorCtr="0" forceAA="0" compatLnSpc="1">
+                        <a:prstTxWarp prst="textNoShape">
+                          <a:avLst/>
+                        </a:prstTxWarp>
+                        <a:spAutoFit/>
+                      </wps:bodyPr>
+                    </wps:wsp>
+                  </a:graphicData>
+                </a:graphic>
+                <wp14:sizeRelH relativeFrom="margin">
+                  <wp14:pctWidth>100000</wp14:pctWidth>
+                </wp14:sizeRelH>
+                <wp14:sizeRelV relativeFrom="margin">
+                  <wp14:pctHeight>0</wp14:pctHeight>
+                </wp14:sizeRelV>
+              </wp:anchor>
+            </w:drawing>
+          </mc:Choice>
+          <mc:Fallback>
+            <w:pict>
+              <v:shape w14:anchorId="1FE6D1D1" id="_x0000_s1029" type="#_x0000_t202" style="position:absolute;margin-left:-7.25pt;margin-top:753.6pt;width:516pt;height:43.9pt;z-index:251691008;visibility:visible;mso-wrap-style:square;mso-width-percent:1000;mso-height-percent:0;mso-wrap-distance-left:9pt;mso-wrap-distance-top:0;mso-wrap-distance-right:9pt;mso-wrap-distance-bottom:0;mso-position-horizontal:absolute;mso-position-horizontal-relative:margin;mso-position-vertical:absolute;mso-position-vertical-relative:page;mso-width-percent:1000;mso-height-percent:0;mso-width-relative:margin;mso-height-relative:margin;v-text-anchor:bottom" o:gfxdata="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" filled="f" stroked="f" strokeweight=".5pt">
+                <v:textbox style="mso-fit-shape-to-text:t" inset="0,0,0,0">
+                  <w:txbxContent>
+                    <w:p>
+                      <w:pPr>
+                        <w:pStyle w:val="NoSpacing"/>
+                        <w:jc w:val="center"/>
+                        <w:rPr>
+                          <w:color w:val="3494BA" w:themeColor="accent1"/>
+                        </w:rPr>
+                      </w:pPr>
+                      <w:r>
+                        <w:rPr>
+                          <w:caps/>
+                          <w:color w:val="3494BA" w:themeColor="accent1"/>
+                          <w:sz w:val="28"/>
+                          <w:szCs w:val="28"/>
+                        </w:rPr>
+                        <w:t>eduSoft</w:t>
+                      </w:r>
+                    </w:p>
+                  </w:txbxContent>
+                </v:textbox>
+                <w10:wrap anchorx="margin" anchory="page"/>
+              </v:shape>
+            </w:pict>
+          </mc:Fallback>
+        </mc:AlternateContent>
+      </w:r>
       <w:r>
         <w:br w:type="page"/>
       </w:r>
@@ -3976,7 +4492,7 @@
           </mc:Choice>
           <mc:Fallback>
             <w:pict>
-              <v:group w14:anchorId="36C93033" id="Graphic 17" o:spid="_x0000_s1026" alt="&quot;&quot;" style="position:absolute;margin-left:-60.35pt;margin-top:-195.65pt;width:649.4pt;height:238.3pt;z-index:-251637760;mso-width-relative:margin;mso-height-relative:margin" coordorigin="-71,-71" coordsize="60055,19240" o:gfxdata="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">
+              <v:group w14:anchorId="5D633808" id="Graphic 17" o:spid="_x0000_s1026" alt="&quot;&quot;" style="position:absolute;margin-left:-60.35pt;margin-top:-195.65pt;width:649.4pt;height:238.3pt;z-index:-251637760;mso-width-relative:margin;mso-height-relative:margin" coordorigin="-71,-71" coordsize="60055,19240" o:gfxdata="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">
                 <v:shape id="Freeform: Shape 175096091" o:spid="_x0000_s1027" style="position:absolute;left:21216;top:-71;width:38767;height:17620;visibility:visible;mso-wrap-style:square;v-text-anchor:middle" coordsize="3876675,1762125" o:gfxdata="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" path="m3869531,1359694v,,-489585,474345,-1509712,384810c1339691,1654969,936784,1180624,7144,1287304l7144,7144r3862387,l3869531,1359694xe" fillcolor="#58b6c0 [3205]" stroked="f">
                   <v:stroke joinstyle="miter"/>
                   <v:path arrowok="t" o:connecttype="custom" o:connectlocs="3869531,1359694;2359819,1744504;7144,1287304;7144,7144;3869531,7144;3869531,1359694" o:connectangles="0,0,0,0,0,0"/>
@@ -4116,6 +4632,130 @@
         <w:spacing w:before="0" w:after="0"/>
         <w:ind w:left="0" w:right="0"/>
       </w:pPr>
+      <w:r>
+        <w:rPr>
+          <w:noProof/>
+          <w:color w:val="3494BA" w:themeColor="accent1"/>
+        </w:rPr>
+        <mc:AlternateContent>
+          <mc:Choice Requires="wps">
+            <w:drawing>
+              <wp:anchor distT="0" distB="0" distL="114300" distR="114300" simplePos="0" relativeHeight="251693056" behindDoc="0" locked="0" layoutInCell="1" allowOverlap="1" wp14:anchorId="6A7C394D" wp14:editId="605E05C8">
+                <wp:simplePos x="0" y="0"/>
+                <wp:positionH relativeFrom="margin">
+                  <wp:posOffset>-195695</wp:posOffset>
+                </wp:positionH>
+                <wp:positionV relativeFrom="page">
+                  <wp:posOffset>9512185</wp:posOffset>
+                </wp:positionV>
+                <wp:extent cx="6553200" cy="557784"/>
+                <wp:effectExtent l="0" t="0" r="0" b="12700"/>
+                <wp:wrapNone/>
+                <wp:docPr id="2132898175" name="Text Box 146"/>
+                <wp:cNvGraphicFramePr/>
+                <a:graphic xmlns:a="http://schemas.openxmlformats.org/drawingml/2006/main">
+                  <a:graphicData uri="http://schemas.microsoft.com/office/word/2010/wordprocessingShape">
+                    <wps:wsp>
+                      <wps:cNvSpPr txBox="1"/>
+                      <wps:spPr>
+                        <a:xfrm>
+                          <a:off x="0" y="0"/>
+                          <a:ext cx="6553200" cy="557784"/>
+                        </a:xfrm>
+                        <a:prstGeom prst="rect">
+                          <a:avLst/>
+                        </a:prstGeom>
+                        <a:noFill/>
+                        <a:ln w="6350">
+                          <a:noFill/>
+                        </a:ln>
+                        <a:effectLst/>
+                      </wps:spPr>
+                      <wps:style>
+                        <a:lnRef idx="0">
+                          <a:schemeClr val="accent1"/>
+                        </a:lnRef>
+                        <a:fillRef idx="0">
+                          <a:schemeClr val="accent1"/>
+                        </a:fillRef>
+                        <a:effectRef idx="0">
+                          <a:schemeClr val="accent1"/>
+                        </a:effectRef>
+                        <a:fontRef idx="minor">
+                          <a:schemeClr val="dk1"/>
+                        </a:fontRef>
+                      </wps:style>
+                      <wps:txbx>
+                        <w:txbxContent>
+                          <w:p>
+                            <w:pPr>
+                              <w:pStyle w:val="NoSpacing"/>
+                              <w:jc w:val="center"/>
+                              <w:rPr>
+                                <w:color w:val="3494BA" w:themeColor="accent1"/>
+                              </w:rPr>
+                            </w:pPr>
+                            <w:r>
+                              <w:rPr>
+                                <w:caps/>
+                                <w:color w:val="3494BA" w:themeColor="accent1"/>
+                                <w:sz w:val="28"/>
+                                <w:szCs w:val="28"/>
+                              </w:rPr>
+                              <w:t>eduSoft</w:t>
+                            </w:r>
+                          </w:p>
+                        </w:txbxContent>
+                      </wps:txbx>
+                      <wps:bodyPr rot="0" spcFirstLastPara="0" vertOverflow="overflow" horzOverflow="overflow" vert="horz" wrap="square" lIns="0" tIns="0" rIns="0" bIns="0" numCol="1" spcCol="0" rtlCol="0" fromWordArt="0" anchor="b" anchorCtr="0" forceAA="0" compatLnSpc="1">
+                        <a:prstTxWarp prst="textNoShape">
+                          <a:avLst/>
+                        </a:prstTxWarp>
+                        <a:spAutoFit/>
+                      </wps:bodyPr>
+                    </wps:wsp>
+                  </a:graphicData>
+                </a:graphic>
+                <wp14:sizeRelH relativeFrom="margin">
+                  <wp14:pctWidth>100000</wp14:pctWidth>
+                </wp14:sizeRelH>
+                <wp14:sizeRelV relativeFrom="margin">
+                  <wp14:pctHeight>0</wp14:pctHeight>
+                </wp14:sizeRelV>
+              </wp:anchor>
+            </w:drawing>
+          </mc:Choice>
+          <mc:Fallback>
+            <w:pict>
+              <v:shape w14:anchorId="6A7C394D" id="_x0000_s1030" type="#_x0000_t202" style="position:absolute;margin-left:-15.4pt;margin-top:749pt;width:516pt;height:43.9pt;z-index:251693056;visibility:visible;mso-wrap-style:square;mso-width-percent:1000;mso-height-percent:0;mso-wrap-distance-left:9pt;mso-wrap-distance-top:0;mso-wrap-distance-right:9pt;mso-wrap-distance-bottom:0;mso-position-horizontal:absolute;mso-position-horizontal-relative:margin;mso-position-vertical:absolute;mso-position-vertical-relative:page;mso-width-percent:1000;mso-height-percent:0;mso-width-relative:margin;mso-height-relative:margin;v-text-anchor:bottom" o:gfxdata="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" filled="f" stroked="f" strokeweight=".5pt">
+                <v:textbox style="mso-fit-shape-to-text:t" inset="0,0,0,0">
+                  <w:txbxContent>
+                    <w:p>
+                      <w:pPr>
+                        <w:pStyle w:val="NoSpacing"/>
+                        <w:jc w:val="center"/>
+                        <w:rPr>
+                          <w:color w:val="3494BA" w:themeColor="accent1"/>
+                        </w:rPr>
+                      </w:pPr>
+                      <w:r>
+                        <w:rPr>
+                          <w:caps/>
+                          <w:color w:val="3494BA" w:themeColor="accent1"/>
+                          <w:sz w:val="28"/>
+                          <w:szCs w:val="28"/>
+                        </w:rPr>
+                        <w:t>eduSoft</w:t>
+                      </w:r>
+                    </w:p>
+                  </w:txbxContent>
+                </v:textbox>
+                <w10:wrap anchorx="margin" anchory="page"/>
+              </v:shape>
+            </w:pict>
+          </mc:Fallback>
+        </mc:AlternateContent>
+      </w:r>
       <w:r>
         <w:br w:type="page"/>
       </w:r>
@@ -4618,7 +5258,7 @@
           </mc:Choice>
           <mc:Fallback>
             <w:pict>
-              <v:group w14:anchorId="315D9701" id="Graphic 17" o:spid="_x0000_s1026" alt="&quot;&quot;" style="position:absolute;margin-left:-40.7pt;margin-top:-162.9pt;width:649.4pt;height:238.3pt;z-index:-251633664;mso-width-relative:margin;mso-height-relative:margin" coordorigin="-71,-71" coordsize="60055,19240" o:gfxdata="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">
+              <v:group w14:anchorId="031300EC" id="Graphic 17" o:spid="_x0000_s1026" alt="&quot;&quot;" style="position:absolute;margin-left:-40.7pt;margin-top:-162.9pt;width:649.4pt;height:238.3pt;z-index:-251633664;mso-width-relative:margin;mso-height-relative:margin" coordorigin="-71,-71" coordsize="60055,19240" o:gfxdata="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">
                 <v:shape id="Freeform: Shape 1024485662" o:spid="_x0000_s1027" style="position:absolute;left:21216;top:-71;width:38767;height:17620;visibility:visible;mso-wrap-style:square;v-text-anchor:middle" coordsize="3876675,1762125" o:gfxdata="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" path="m3869531,1359694v,,-489585,474345,-1509712,384810c1339691,1654969,936784,1180624,7144,1287304l7144,7144r3862387,l3869531,1359694xe" fillcolor="#58b6c0 [3205]" stroked="f">
                   <v:stroke joinstyle="miter"/>
                   <v:path arrowok="t" o:connecttype="custom" o:connectlocs="3869531,1359694;2359819,1744504;7144,1287304;7144,7144;3869531,7144;3869531,1359694" o:connectangles="0,0,0,0,0,0"/>
@@ -4851,6 +5491,130 @@
           <w:szCs w:val="36"/>
         </w:rPr>
       </w:pPr>
+      <w:r>
+        <w:rPr>
+          <w:noProof/>
+          <w:color w:val="3494BA" w:themeColor="accent1"/>
+        </w:rPr>
+        <mc:AlternateContent>
+          <mc:Choice Requires="wps">
+            <w:drawing>
+              <wp:anchor distT="0" distB="0" distL="114300" distR="114300" simplePos="0" relativeHeight="251695104" behindDoc="0" locked="0" layoutInCell="1" allowOverlap="1" wp14:anchorId="6BE3EAA4" wp14:editId="37FC12A5">
+                <wp:simplePos x="0" y="0"/>
+                <wp:positionH relativeFrom="margin">
+                  <wp:posOffset>-83128</wp:posOffset>
+                </wp:positionH>
+                <wp:positionV relativeFrom="page">
+                  <wp:posOffset>9604375</wp:posOffset>
+                </wp:positionV>
+                <wp:extent cx="6553200" cy="557784"/>
+                <wp:effectExtent l="0" t="0" r="0" b="12700"/>
+                <wp:wrapNone/>
+                <wp:docPr id="793017568" name="Text Box 146"/>
+                <wp:cNvGraphicFramePr/>
+                <a:graphic xmlns:a="http://schemas.openxmlformats.org/drawingml/2006/main">
+                  <a:graphicData uri="http://schemas.microsoft.com/office/word/2010/wordprocessingShape">
+                    <wps:wsp>
+                      <wps:cNvSpPr txBox="1"/>
+                      <wps:spPr>
+                        <a:xfrm>
+                          <a:off x="0" y="0"/>
+                          <a:ext cx="6553200" cy="557784"/>
+                        </a:xfrm>
+                        <a:prstGeom prst="rect">
+                          <a:avLst/>
+                        </a:prstGeom>
+                        <a:noFill/>
+                        <a:ln w="6350">
+                          <a:noFill/>
+                        </a:ln>
+                        <a:effectLst/>
+                      </wps:spPr>
+                      <wps:style>
+                        <a:lnRef idx="0">
+                          <a:schemeClr val="accent1"/>
+                        </a:lnRef>
+                        <a:fillRef idx="0">
+                          <a:schemeClr val="accent1"/>
+                        </a:fillRef>
+                        <a:effectRef idx="0">
+                          <a:schemeClr val="accent1"/>
+                        </a:effectRef>
+                        <a:fontRef idx="minor">
+                          <a:schemeClr val="dk1"/>
+                        </a:fontRef>
+                      </wps:style>
+                      <wps:txbx>
+                        <w:txbxContent>
+                          <w:p>
+                            <w:pPr>
+                              <w:pStyle w:val="NoSpacing"/>
+                              <w:jc w:val="center"/>
+                              <w:rPr>
+                                <w:color w:val="3494BA" w:themeColor="accent1"/>
+                              </w:rPr>
+                            </w:pPr>
+                            <w:r>
+                              <w:rPr>
+                                <w:caps/>
+                                <w:color w:val="3494BA" w:themeColor="accent1"/>
+                                <w:sz w:val="28"/>
+                                <w:szCs w:val="28"/>
+                              </w:rPr>
+                              <w:t>eduSoft</w:t>
+                            </w:r>
+                          </w:p>
+                        </w:txbxContent>
+                      </wps:txbx>
+                      <wps:bodyPr rot="0" spcFirstLastPara="0" vertOverflow="overflow" horzOverflow="overflow" vert="horz" wrap="square" lIns="0" tIns="0" rIns="0" bIns="0" numCol="1" spcCol="0" rtlCol="0" fromWordArt="0" anchor="b" anchorCtr="0" forceAA="0" compatLnSpc="1">
+                        <a:prstTxWarp prst="textNoShape">
+                          <a:avLst/>
+                        </a:prstTxWarp>
+                        <a:spAutoFit/>
+                      </wps:bodyPr>
+                    </wps:wsp>
+                  </a:graphicData>
+                </a:graphic>
+                <wp14:sizeRelH relativeFrom="margin">
+                  <wp14:pctWidth>100000</wp14:pctWidth>
+                </wp14:sizeRelH>
+                <wp14:sizeRelV relativeFrom="margin">
+                  <wp14:pctHeight>0</wp14:pctHeight>
+                </wp14:sizeRelV>
+              </wp:anchor>
+            </w:drawing>
+          </mc:Choice>
+          <mc:Fallback>
+            <w:pict>
+              <v:shape w14:anchorId="6BE3EAA4" id="_x0000_s1031" type="#_x0000_t202" style="position:absolute;margin-left:-6.55pt;margin-top:756.25pt;width:516pt;height:43.9pt;z-index:251695104;visibility:visible;mso-wrap-style:square;mso-width-percent:1000;mso-height-percent:0;mso-wrap-distance-left:9pt;mso-wrap-distance-top:0;mso-wrap-distance-right:9pt;mso-wrap-distance-bottom:0;mso-position-horizontal:absolute;mso-position-horizontal-relative:margin;mso-position-vertical:absolute;mso-position-vertical-relative:page;mso-width-percent:1000;mso-height-percent:0;mso-width-relative:margin;mso-height-relative:margin;v-text-anchor:bottom" o:gfxdata="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" filled="f" stroked="f" strokeweight=".5pt">
+                <v:textbox style="mso-fit-shape-to-text:t" inset="0,0,0,0">
+                  <w:txbxContent>
+                    <w:p>
+                      <w:pPr>
+                        <w:pStyle w:val="NoSpacing"/>
+                        <w:jc w:val="center"/>
+                        <w:rPr>
+                          <w:color w:val="3494BA" w:themeColor="accent1"/>
+                        </w:rPr>
+                      </w:pPr>
+                      <w:r>
+                        <w:rPr>
+                          <w:caps/>
+                          <w:color w:val="3494BA" w:themeColor="accent1"/>
+                          <w:sz w:val="28"/>
+                          <w:szCs w:val="28"/>
+                        </w:rPr>
+                        <w:t>eduSoft</w:t>
+                      </w:r>
+                    </w:p>
+                  </w:txbxContent>
+                </v:textbox>
+                <w10:wrap anchorx="margin" anchory="page"/>
+              </v:shape>
+            </w:pict>
+          </mc:Fallback>
+        </mc:AlternateContent>
+      </w:r>
     </w:p>
     <w:p>
       <w:pPr>
@@ -4863,7 +5627,6 @@
       </w:pPr>
     </w:p>
     <w:sectPr>
-      <w:footerReference w:type="default" r:id="rId15"/>
       <w:pgSz w:w="12240" w:h="15840" w:code="1"/>
       <w:pgMar w:top="720" w:right="720" w:bottom="720" w:left="720" w:header="720" w:footer="720" w:gutter="0"/>
       <w:pgNumType w:start="0"/>
@@ -4898,17 +5661,6 @@
     </w:p>
   </w:endnote>
 </w:endnotes>
-</file>
-
-<file path=word/footer1.xml><?xml version="1.0" encoding="utf-8"?>
-<w:ftr xmlns:wpc="http://schemas.microsoft.com/office/word/2010/wordprocessingCanvas" xmlns:cx="http://schemas.microsoft.com/office/drawing/2014/chartex" xmlns:cx1="http://schemas.microsoft.com/office/drawing/2015/9/8/chartex" xmlns:cx2="http://schemas.microsoft.com/office/drawing/2015/10/21/chartex" xmlns:cx3="http://schemas.microsoft.com/office/drawing/2016/5/9/chartex" xmlns:cx4="http://schemas.microsoft.com/office/drawing/2016/5/10/chartex" xmlns:cx5="http://schemas.microsoft.com/office/drawing/2016/5/11/chartex" xmlns:cx6="http://schemas.microsoft.com/office/drawing/2016/5/12/chartex" xmlns:cx7="http://schemas.microsoft.com/office/drawing/2016/5/13/chartex" xmlns:cx8="http://schemas.microsoft.com/office/drawing/2016/5/14/chartex" xmlns:mc="http://schemas.openxmlformats.org/markup-compatibility/2006" xmlns:aink="http://schemas.microsoft.com/office/drawing/2016/ink" xmlns:am3d="http://schemas.microsoft.com/office/drawing/2017/model3d" xmlns:o="urn:schemas-microsoft-com:office:office" xmlns:oel="http://schemas.microsoft.com/office/2019/extlst" xmlns:r="http://schemas.openxmlformats.org/officeDocument/2006/relationships" xmlns:m="http://schemas.openxmlformats.org/officeDocument/2006/math" xmlns:v="urn:schemas-microsoft-com:vml" xmlns:wp14="http://schemas.microsoft.com/office/word/2010/wordprocessingDrawing" xmlns:wp="http://schemas.openxmlformats.org/drawingml/2006/wordprocessingDrawing" xmlns:w10="urn:schemas-microsoft-com:office:word" xmlns:w="http://schemas.openxmlformats.org/wordprocessingml/2006/main" xmlns:w14="http://schemas.microsoft.com/office/word/2010/wordml" xmlns:w15="http://schemas.microsoft.com/office/word/2012/wordml" xmlns:w16cex="http://schemas.microsoft.com/office/word/2018/wordml/cex" xmlns:w16cid="http://schemas.microsoft.com/office/word/2016/wordml/cid" xmlns:w16="http://schemas.microsoft.com/office/word/2018/wordml" xmlns:w16du="http://schemas.microsoft.com/office/word/2023/wordml/word16du" xmlns:w16sdtdh="http://schemas.microsoft.com/office/word/2020/wordml/sdtdatahash" xmlns:w16sdtfl="http://schemas.microsoft.com/office/word/2024/wordml/sdtformatlock" xmlns:w16se="http://schemas.microsoft.com/office/word/2015/wordml/symex" xmlns:wpg="http://schemas.microsoft.com/office/word/2010/wordprocessingGroup" xmlns:wpi="http://schemas.microsoft.com/office/word/2010/wordprocessingInk" xmlns:wne="http://schemas.microsoft.com/office/word/2006/wordml" xmlns:wps="http://schemas.microsoft.com/office/word/2010/wordprocessingShape" mc:Ignorable="w14 w15 w16se w16cid w16 w16cex w16sdtdh w16sdtfl w16du wp14">
-  <w:p>
-    <w:pPr>
-      <w:pStyle w:val="Signature"/>
-      <w:jc w:val="center"/>
-    </w:pPr>
-  </w:p>
-</w:ftr>
 </file>
 
 <file path=word/footnotes.xml><?xml version="1.0" encoding="utf-8"?>
@@ -6793,9 +7545,9 @@
   </w:compat>
   <w:rsids>
     <w:rsidRoot w:val="00756047"/>
-    <w:rsid w:val="0023283D"/>
     <w:rsid w:val="00756047"/>
     <w:rsid w:val="007F067D"/>
+    <w:rsid w:val="00D67F51"/>
   </w:rsids>
   <m:mathPr>
     <m:mathFont m:val="Cambria Math"/>
@@ -7306,10 +8058,6 @@
   </w:style>
   <w:style w:type="paragraph" w:customStyle="1" w:styleId="7C1218CD1E164B5D96F6FA3A563FF26F">
     <w:name w:val="7C1218CD1E164B5D96F6FA3A563FF26F"/>
-    <w:rsid w:val="00756047"/>
-  </w:style>
-  <w:style w:type="paragraph" w:customStyle="1" w:styleId="74930B87DEBE4C47940C341787AC7022">
-    <w:name w:val="74930B87DEBE4C47940C341787AC7022"/>
     <w:rsid w:val="00756047"/>
   </w:style>
 </w:styles>

</xml_diff>